<commit_message>
Fixed nested git repositories to show actual files
</commit_message>
<xml_diff>
--- a/5th Semester/FSD Lab/All Lab files/Assignemnt no 01.docx
+++ b/5th Semester/FSD Lab/All Lab files/Assignemnt no 01.docx
@@ -13,6 +13,7 @@
           <w:docPartUnique/>
         </w:docPartObj>
       </w:sdtPr>
+      <w:sdtEndPr/>
       <w:sdtContent>
         <w:p>
           <w:pPr>
@@ -151,6 +152,7 @@
                                       <w:calendar w:val="gregorian"/>
                                     </w:date>
                                   </w:sdtPr>
+                                  <w:sdtEndPr/>
                                   <w:sdtContent>
                                     <w:p>
                                       <w:pPr>
@@ -3965,7 +3967,7 @@
                                         </pic:cNvPicPr>
                                       </pic:nvPicPr>
                                       <pic:blipFill>
-                                        <a:blip r:embed="rId6">
+                                        <a:blip r:embed="rId7">
                                           <a:extLst>
                                             <a:ext uri="{28A0092B-C50C-407E-A947-70E740481C1C}">
                                               <a14:useLocalDpi xmlns:a14="http://schemas.microsoft.com/office/drawing/2010/main" val="0"/>
@@ -4082,6 +4084,7 @@
                                     <w:dataBinding w:prefixMappings="xmlns:ns0='http://purl.org/dc/elements/1.1/' xmlns:ns1='http://schemas.openxmlformats.org/package/2006/metadata/core-properties' " w:xpath="/ns1:coreProperties[1]/ns0:title[1]" w:storeItemID="{6C3C8BC8-F283-45AE-878A-BAB7291924A1}"/>
                                     <w:text/>
                                   </w:sdtPr>
+                                  <w:sdtEndPr/>
                                   <w:sdtContent>
                                     <w:r>
                                       <w:rPr>
@@ -4117,6 +4120,7 @@
                                     <w:dataBinding w:prefixMappings="xmlns:ns0='http://purl.org/dc/elements/1.1/' xmlns:ns1='http://schemas.openxmlformats.org/package/2006/metadata/core-properties' " w:xpath="/ns1:coreProperties[1]/ns0:subject[1]" w:storeItemID="{6C3C8BC8-F283-45AE-878A-BAB7291924A1}"/>
                                     <w:text/>
                                   </w:sdtPr>
+                                  <w:sdtEndPr/>
                                   <w:sdtContent>
                                     <w:r>
                                       <w:rPr>
@@ -4256,21 +4260,6 @@
     </w:sdt>
     <w:p>
       <w:pPr>
-        <w:jc w:val="center"/>
-        <w:rPr>
-          <w:sz w:val="40"/>
-        </w:rPr>
-      </w:pPr>
-      <w:r>
-        <w:rPr>
-          <w:sz w:val="40"/>
-        </w:rPr>
-        <w:lastRenderedPageBreak/>
-        <w:t>Assignment no 01</w:t>
-      </w:r>
-    </w:p>
-    <w:p>
-      <w:pPr>
         <w:spacing w:after="0"/>
         <w:rPr>
           <w:b/>
@@ -4278,22 +4267,13 @@
           <w:sz w:val="28"/>
         </w:rPr>
       </w:pPr>
-    </w:p>
-    <w:p>
-      <w:pPr>
-        <w:spacing w:after="0"/>
+      <w:r>
         <w:rPr>
           <w:b/>
           <w:color w:val="000000" w:themeColor="text1"/>
           <w:sz w:val="28"/>
         </w:rPr>
-      </w:pPr>
-      <w:r>
-        <w:rPr>
-          <w:b/>
-          <w:color w:val="000000" w:themeColor="text1"/>
-          <w:sz w:val="28"/>
-        </w:rPr>
+        <w:lastRenderedPageBreak/>
         <w:t>XAMPP Control Panel:</w:t>
       </w:r>
     </w:p>
@@ -4309,6 +4289,7 @@
       <w:r>
         <w:rPr>
           <w:b/>
+          <w:noProof/>
           <w:color w:val="000000" w:themeColor="text1"/>
           <w:sz w:val="14"/>
         </w:rPr>
@@ -4328,7 +4309,7 @@
                     <pic:cNvPicPr/>
                   </pic:nvPicPr>
                   <pic:blipFill rotWithShape="1">
-                    <a:blip r:embed="rId7"/>
+                    <a:blip r:embed="rId8"/>
                     <a:srcRect l="1338" t="1871" r="1115" b="5461"/>
                     <a:stretch/>
                   </pic:blipFill>
@@ -4400,6 +4381,7 @@
       <w:r>
         <w:rPr>
           <w:b/>
+          <w:noProof/>
           <w:color w:val="000000" w:themeColor="text1"/>
           <w:sz w:val="32"/>
         </w:rPr>
@@ -4419,7 +4401,7 @@
                     <pic:cNvPicPr/>
                   </pic:nvPicPr>
                   <pic:blipFill>
-                    <a:blip r:embed="rId8"/>
+                    <a:blip r:embed="rId9"/>
                     <a:stretch>
                       <a:fillRect/>
                     </a:stretch>
@@ -4454,17 +4436,16 @@
           <w:sz w:val="32"/>
         </w:rPr>
       </w:pPr>
-      <w:proofErr w:type="spellStart"/>
-      <w:r>
+    </w:p>
+    <w:p>
+      <w:pPr>
+        <w:spacing w:after="0"/>
         <w:rPr>
           <w:b/>
           <w:color w:val="000000" w:themeColor="text1"/>
           <w:sz w:val="32"/>
         </w:rPr>
-        <w:lastRenderedPageBreak/>
-        <w:t>PhpMyAdmin</w:t>
-      </w:r>
-      <w:proofErr w:type="spellEnd"/>
+      </w:pPr>
     </w:p>
     <w:p>
       <w:pPr>
@@ -4475,9 +4456,33 @@
           <w:sz w:val="32"/>
         </w:rPr>
       </w:pPr>
+      <w:bookmarkStart w:id="0" w:name="_GoBack"/>
+      <w:bookmarkEnd w:id="0"/>
+      <w:proofErr w:type="spellStart"/>
       <w:r>
         <w:rPr>
           <w:b/>
+          <w:color w:val="000000" w:themeColor="text1"/>
+          <w:sz w:val="32"/>
+        </w:rPr>
+        <w:lastRenderedPageBreak/>
+        <w:t>PhpMyAdmin</w:t>
+      </w:r>
+      <w:proofErr w:type="spellEnd"/>
+    </w:p>
+    <w:p>
+      <w:pPr>
+        <w:spacing w:after="0"/>
+        <w:rPr>
+          <w:b/>
+          <w:color w:val="000000" w:themeColor="text1"/>
+          <w:sz w:val="32"/>
+        </w:rPr>
+      </w:pPr>
+      <w:r>
+        <w:rPr>
+          <w:b/>
+          <w:noProof/>
           <w:color w:val="000000" w:themeColor="text1"/>
           <w:sz w:val="32"/>
         </w:rPr>
@@ -4497,7 +4502,7 @@
                     <pic:cNvPicPr/>
                   </pic:nvPicPr>
                   <pic:blipFill>
-                    <a:blip r:embed="rId9"/>
+                    <a:blip r:embed="rId10"/>
                     <a:stretch>
                       <a:fillRect/>
                     </a:stretch>
@@ -4564,6 +4569,7 @@
       <w:r>
         <w:rPr>
           <w:b/>
+          <w:noProof/>
           <w:color w:val="000000" w:themeColor="text1"/>
           <w:sz w:val="44"/>
         </w:rPr>
@@ -4583,7 +4589,7 @@
                     <pic:cNvPicPr/>
                   </pic:nvPicPr>
                   <pic:blipFill>
-                    <a:blip r:embed="rId10"/>
+                    <a:blip r:embed="rId11"/>
                     <a:stretch>
                       <a:fillRect/>
                     </a:stretch>
@@ -4611,6 +4617,7 @@
       <w:r>
         <w:rPr>
           <w:b/>
+          <w:noProof/>
           <w:color w:val="000000" w:themeColor="text1"/>
           <w:sz w:val="44"/>
         </w:rPr>
@@ -4630,7 +4637,7 @@
                     <pic:cNvPicPr/>
                   </pic:nvPicPr>
                   <pic:blipFill>
-                    <a:blip r:embed="rId11"/>
+                    <a:blip r:embed="rId12"/>
                     <a:stretch>
                       <a:fillRect/>
                     </a:stretch>
@@ -4668,6 +4675,7 @@
       <w:r>
         <w:rPr>
           <w:b/>
+          <w:noProof/>
           <w:color w:val="000000" w:themeColor="text1"/>
           <w:sz w:val="44"/>
         </w:rPr>
@@ -4688,7 +4696,7 @@
                     <pic:cNvPicPr/>
                   </pic:nvPicPr>
                   <pic:blipFill>
-                    <a:blip r:embed="rId12"/>
+                    <a:blip r:embed="rId13"/>
                     <a:stretch>
                       <a:fillRect/>
                     </a:stretch>
@@ -4726,6 +4734,7 @@
       <w:r>
         <w:rPr>
           <w:b/>
+          <w:noProof/>
           <w:color w:val="000000" w:themeColor="text1"/>
           <w:sz w:val="44"/>
         </w:rPr>
@@ -4745,7 +4754,7 @@
                     <pic:cNvPicPr/>
                   </pic:nvPicPr>
                   <pic:blipFill rotWithShape="1">
-                    <a:blip r:embed="rId13"/>
+                    <a:blip r:embed="rId14"/>
                     <a:srcRect t="64656" b="8415"/>
                     <a:stretch/>
                   </pic:blipFill>
@@ -4781,6 +4790,7 @@
       <w:r>
         <w:rPr>
           <w:b/>
+          <w:noProof/>
           <w:color w:val="000000" w:themeColor="text1"/>
           <w:sz w:val="44"/>
         </w:rPr>
@@ -4800,7 +4810,7 @@
                     <pic:cNvPicPr/>
                   </pic:nvPicPr>
                   <pic:blipFill>
-                    <a:blip r:embed="rId14"/>
+                    <a:blip r:embed="rId15"/>
                     <a:stretch>
                       <a:fillRect/>
                     </a:stretch>
@@ -23250,8 +23260,6 @@
           <w:sz w:val="24"/>
         </w:rPr>
       </w:pPr>
-      <w:bookmarkStart w:id="0" w:name="_GoBack"/>
-      <w:bookmarkEnd w:id="0"/>
     </w:p>
     <w:sectPr>
       <w:pgSz w:w="12240" w:h="15840"/>
@@ -24016,7 +24024,7 @@
 </file>
 
 <file path=customXml/itemProps2.xml><?xml version="1.0" encoding="utf-8"?>
-<ds:datastoreItem xmlns:ds="http://schemas.openxmlformats.org/officeDocument/2006/customXml" ds:itemID="{74E61B54-D46F-4FDD-A65F-4DADAA6FDBED}">
+<ds:datastoreItem xmlns:ds="http://schemas.openxmlformats.org/officeDocument/2006/customXml" ds:itemID="{77CBD5D0-C68D-4CA4-BEC7-7535F2EB40E3}">
   <ds:schemaRefs>
     <ds:schemaRef ds:uri="http://schemas.openxmlformats.org/officeDocument/2006/bibliography"/>
   </ds:schemaRefs>

</xml_diff>